<commit_message>
feat: expand academic presentation, PDF, viva Q&A, and mapping to cover both Question 1 and Question 2
</commit_message>
<xml_diff>
--- a/Presentation/BPMN_Viva_Questions_and_Answers.docx
+++ b/Presentation/BPMN_Viva_Questions_and_Answers.docx
@@ -18,15 +18,15 @@
     </w:p>
     <w:p>
       <w:pPr>
-        <w:spacing w:after="320"/>
+        <w:spacing w:after="280"/>
       </w:pPr>
       <w:r>
         <w:rPr>
           <w:rFonts w:ascii="Arial" w:hAnsi="Arial"/>
           <w:color w:val="0096B4"/>
-          <w:sz w:val="28"/>
+          <w:sz w:val="26"/>
         </w:rPr>
-        <w:t>Academic Examination &amp; Defence Guide: Loan Origination &amp; Approval System</w:t>
+        <w:t>Academic Examination &amp; Defence Guide: Questions 1 &amp; 2 (Student Project &amp; Loan Origination)</w:t>
       </w:r>
     </w:p>
     <w:tbl>
@@ -266,7 +266,7 @@
                 <w:color w:val="0369A1"/>
                 <w:sz w:val="20"/>
               </w:rPr>
-              <w:t xml:space="preserve">PURPOSE OF THIS VIVA GUIDE: </w:t>
+              <w:t xml:space="preserve">SCOPE &amp; COVERAGE OF THIS VIVA GUIDE: </w:t>
             </w:r>
             <w:r>
               <w:rPr>
@@ -274,7 +274,7 @@
                 <w:color w:val="0F172A"/>
                 <w:sz w:val="19"/>
               </w:rPr>
-              <w:t>This document prepares the candidate for comprehensive academic questioning on BPMN 2.0 principles, modelling decisions, gateway semantics, event-driven failure containment, and project-specific execution in the Loan Origination &amp; Approval System. Answers are structured with theoretical rigor and grounded directly in the project diagram.</w:t>
+              <w:t>This guide prepares the candidate for comprehensive examination on BOTH modelled assignment workflows: (1) Question 1: Student Project Approval &amp; Allocation System (academic governance, 5 lanes, DMN guide matching), and (2) Question 2: Loan Origination &amp; Approval System (retail banking, 7 lanes/pools, parallel concurrency, financial error trapping). Answers provide theoretical depth, exact BPMN 2.0 semantics, and direct evidence from project models.</w:t>
             </w:r>
           </w:p>
         </w:tc>
@@ -314,7 +314,7 @@
                 <w:color w:val="38BDF8"/>
                 <w:sz w:val="19"/>
               </w:rPr>
-              <w:t>[Q1 — BPMN TASK TYPES]</w:t>
+              <w:t>[Q1 — BPMN TASK TYPES COMPARISON]</w:t>
               <w:br/>
             </w:r>
             <w:r>
@@ -324,7 +324,7 @@
                 <w:color w:val="F8FAFC"/>
                 <w:sz w:val="22"/>
               </w:rPr>
-              <w:t>Why did you choose specific task types (User, Service, Send, Receive) rather than generic unadorned tasks?</w:t>
+              <w:t>What task types did you use across Question 1 and Question 2, and why did you choose specific types rather than generic tasks?</w:t>
             </w:r>
           </w:p>
         </w:tc>
@@ -368,19 +368,35 @@
                 <w:color w:val="1E293B"/>
                 <w:sz w:val="20"/>
               </w:rPr>
-              <w:t>In BPMN 2.0, an unadorned, generic task carries no execution semantics—it does not indicate whether it is executed by a human, a script, a web service, or an asynchronous message. In an executable workflow engine like Camunda 8 (Zeebe), each task type triggers different engine handlers:</w:t>
+              <w:t>In BPMN 2.0, unadorned generic tasks lack execution semantics—they fail to define whether work is performed by human agents, automated software microservices, or asynchronous message exchanges. In an enterprise BPMN engine like Camunda, task typing dictates runtime handler routing:</w:t>
               <w:br/>
               <w:br/>
-              <w:t>• User Tasks (e.g., 'Submit Loan Application', 'Underwriter Full Manual Review', 'E-Sign Loan Agreement'): represent work that requires human cognition, subjective assessment, or physical form input. The engine generates a task in a human task list.</w:t>
+              <w:t>• User Tasks (👤): Represent work requiring human cognition, subjective evaluation, or form entry.</w:t>
               <w:br/>
-              <w:t>• Service Tasks (e.g., 'KYC Identity Verification', 'AML Watchlist Screening', 'Disburse Loan Funds'): represent automated software execution. They invoke REST APIs, microservices, or external database queries without human intervention.</w:t>
+              <w:t xml:space="preserve">  - Q1 Examples: 'Prepare and Submit Proposal' (Student), 'Evaluate Proposal' (Committee), 'Manual Guide Allocation' (Coordinator).</w:t>
               <w:br/>
-              <w:t>• Send Tasks (e.g., 'Request Credit Report', 'Send Loan Offer'): model active dispatch of asynchronous messages across participant or pool boundaries.</w:t>
-              <w:br/>
-              <w:t>• Intermediate Message Catch Events / Receive Tasks (e.g., 'Receive Credit Report'): pause token execution until a correlated message payload arrives from an independent system.</w:t>
+              <w:t xml:space="preserve">  - Q2 Examples: 'Submit Loan Application' (Applicant), 'Underwriter Full Manual Review' (Underwriter), 'E-Sign Agreement' (Applicant).</w:t>
               <w:br/>
               <w:br/>
-              <w:t>We explicitly rejected Script Tasks for core scoring because complex risk models and KYC checks rely on enterprise SOA infrastructure rather than in-engine Groovy scripts.</w:t>
+              <w:t>• Service Tasks (⚙️): Represent automated software execution invoking REST/SOAP APIs, internal algorithms, or database queries without human intervention.</w:t>
+              <w:br/>
+              <w:t xml:space="preserve">  - Q1 Examples: 'Validate Completeness', 'Validate Team Rules', 'Similarity &amp; Duplicate Check', 'Auto-Allocate Guide'.</w:t>
+              <w:br/>
+              <w:t xml:space="preserve">  - Q2 Examples: 'KYC Identity Verification API', 'AML Screening API', 'Automated DTI Calculation', 'Disburse Loan Funds'.</w:t>
+              <w:br/>
+              <w:br/>
+              <w:t>• Send Tasks &amp; Receive/Message Catch (✉️ / 📥): Model active outbound message dispatch and passive waiting across participant boundaries.</w:t>
+              <w:br/>
+              <w:t xml:space="preserve">  - Q1: Send Task 'Send Guide Allocation Request' paired with Catch 'Receive Guide Acceptance'.</w:t>
+              <w:br/>
+              <w:t xml:space="preserve">  - Q2: Send Task 'Request Credit Report' paired with Catch 'Receive Credit Report' from external Credit Bureau.</w:t>
+              <w:br/>
+              <w:br/>
+              <w:t>• Business Rule Task (📊) &amp; Script Task (📜) in Q1:</w:t>
+              <w:br/>
+              <w:t xml:space="preserve">  - 'Check Guide Availability, Workload &amp; Domain Match' uses a Business Rule Task to execute a DMN decision table.</w:t>
+              <w:br/>
+              <w:t xml:space="preserve">  - 'Log Withdrawal &amp; Release Guide Pre-Assignment' uses a Script Task to immediately free allocated resources in engine memory.</w:t>
             </w:r>
           </w:p>
         </w:tc>
@@ -430,7 +446,7 @@
                 <w:color w:val="F8FAFC"/>
                 <w:sz w:val="22"/>
               </w:rPr>
-              <w:t>What is the exact functional and semantic difference between Exclusive (XOR) and Parallel (AND) Gateways in your model?</w:t>
+              <w:t>How do gateways differ between Question 1 and Question 2? Explain why Parallel Gateways were used in Q2 and Event-Based Gateways in Q1.</w:t>
             </w:r>
           </w:p>
         </w:tc>
@@ -474,16 +490,26 @@
                 <w:color w:val="1E293B"/>
                 <w:sz w:val="20"/>
               </w:rPr>
-              <w:t>Gateways in BPMN 2.0 govern token routing, synchronization, and decision branching:</w:t>
+              <w:t>Gateways control divergence and convergence of sequence flows:</w:t>
               <w:br/>
               <w:br/>
-              <w:t>• Parallel Gateway (AND): Evaluates NO conditions. Upon splitting ('Start Parallel Verification Checks'), it replicates incoming tokens across ALL outgoing branches simultaneously (in our project: 1. KYC/AML screening, 2. Credit Bureau request, 3. DTI calculation). Upon joining ('All Parallel Checks Complete'), it acts as a synchronizer: it halts progression until a token arrives from every single concurrent incoming branch. This guarantees zero race conditions.</w:t>
+              <w:t>• Exclusive Gateway (XOR ✕): Used in BOTH models for mutually exclusive condition routing.</w:t>
+              <w:br/>
+              <w:t xml:space="preserve">  - Q1: 'Proposal Valid?', 'Committee Decision' (Approve / Revise / Reject), 'Guide Available?'.</w:t>
+              <w:br/>
+              <w:t xml:space="preserve">  - Q2: 'KYC Passed?', 'Eligibility Decision' (Auto-Approve / Manual Review / Reject), 'Offer Decision'.</w:t>
+              <w:br/>
+              <w:t xml:space="preserve">  - Justification: Outcomes are mutually exclusive; an application cannot be simultaneously approved and rejected.</w:t>
               <w:br/>
               <w:br/>
-              <w:t>• Exclusive Gateway (XOR): Evaluates mutually exclusive sequence flow condition expressions and passes exactly ONE token along the first branch whose condition evaluates to true. Upon joining, it passes any arriving token immediately without synchronization.</w:t>
+              <w:t>• Parallel Gateway (AND ✛) in Question 2:</w:t>
+              <w:br/>
+              <w:t xml:space="preserve">  - Used for deterministic concurrency: 'Start Parallel Verification Checks' splits flow concurrently into (1) KYC/AML screening, (2) Credit Bureau request, and (3) DTI calculation. The join ('All Parallel Checks Complete') synchronizes all three streams before income verification. This cuts cycle times by &gt;60% while eliminating token race conditions.</w:t>
               <w:br/>
               <w:br/>
-              <w:t>In our model, Parallel Gateways handle independent background checks to reduce turnaround time, while Exclusive Gateways enforce business decisions (e.g., Approve vs. Reject vs. Revise).</w:t>
+              <w:t>• Event-Based Gateway (⬡) in Question 1:</w:t>
+              <w:br/>
+              <w:t xml:space="preserve">  - Used for competing asynchronous events: after sending the allocation request to the faculty guide, an Event-Based Gateway waits for either: Branch A: Message Catch 'Guide Accepts Request', OR Branch B: 3-Day Timer Event 'Guide Response Timeout'. The first event to occur dictates the path.</w:t>
             </w:r>
           </w:p>
         </w:tc>
@@ -523,7 +549,7 @@
                 <w:color w:val="38BDF8"/>
                 <w:sz w:val="19"/>
               </w:rPr>
-              <w:t>[Q3 — INTERMEDIATE VS BOUNDARY EVENTS]</w:t>
+              <w:t>[Q3 — INTERMEDIATE &amp; BOUNDARY EVENTS]</w:t>
               <w:br/>
             </w:r>
             <w:r>
@@ -533,7 +559,7 @@
                 <w:color w:val="F8FAFC"/>
                 <w:sz w:val="22"/>
               </w:rPr>
-              <w:t>What is an intermediate event, and what is the crucial architectural difference between an intermediate event in the normal flow and a boundary event?</w:t>
+              <w:t>What is an intermediate event, and what is the crucial architectural difference between an inline intermediate event and a task boundary event?</w:t>
             </w:r>
           </w:p>
         </w:tc>
@@ -577,19 +603,23 @@
                 <w:color w:val="1E293B"/>
                 <w:sz w:val="20"/>
               </w:rPr>
-              <w:t>An Intermediate Event is an event that occurs between the start and end of a process lifecycle, affecting the flow of the process without starting or ending it directly.</w:t>
+              <w:t>An Intermediate Event occurs between the start and end of a process, affecting flow without directly creating or terminating the process instance.</w:t>
               <w:br/>
               <w:br/>
-              <w:t>The fundamental architectural distinction is:</w:t>
+              <w:t>The fundamental architectural distinction:</w:t>
               <w:br/>
-              <w:t>1. Inline Intermediate Events: Sit directly on a sequence flow (connected by incoming and outgoing sequence flows). When a token arrives, it enters a waiting state until the specified trigger occurs (e.g., our 'Receive Credit Report' message catch event). The process simply halts at that point in the normal path.</w:t>
+              <w:t>1. Inline Intermediate Events: Sit directly on a sequence flow. When a token arrives, execution halts in a waiting state until triggered.</w:t>
+              <w:br/>
+              <w:t xml:space="preserve">   - Q1: 'Receive Guide Acceptance' &amp; 'Receive Revision Request'.</w:t>
+              <w:br/>
+              <w:t xml:space="preserve">   - Q2: 'Receive Credit Report' (pauses Core Banking until credit agency message payload arrives).</w:t>
               <w:br/>
               <w:br/>
-              <w:t>2. Boundary Events: Attach directly to the outer perimeter/boundary of an activity (a Task or Sub-Process). They monitor the activity WHILE it is active. If the trigger occurs while the activity is executing:</w:t>
+              <w:t>2. Boundary Events: Attach directly to the outer border of an active Task or Sub-Process, monitoring execution in real-time:</w:t>
               <w:br/>
-              <w:t xml:space="preserve">   - An Interrupting Boundary Event (solid double border) immediately cancels the activity and diverts the token down the exception path.</w:t>
+              <w:t xml:space="preserve">   - Interrupting Boundary Event (Solid Double Ring): Immediately aborts/cancels the active task and diverts the token down the exception path (e.g., Q1 14-day submission timeout, Q2 7-day offer validity expiry, Q2 disbursement error).</w:t>
               <w:br/>
-              <w:t xml:space="preserve">   - A Non-Interrupting Boundary Event (dashed double border) spawns a parallel token down the exception branch while keeping the underlying activity running.</w:t>
+              <w:t xml:space="preserve">   - Non-Interrupting Boundary Event (Dashed Double Ring): Spawns a parallel escalation token while leaving the underlying task active (e.g., Q1 10-day committee review SLA reminder to HoD, Q2 24-hour credit retry, Q2 48-hour e-sign alert).</w:t>
             </w:r>
           </w:p>
         </w:tc>
@@ -629,7 +659,7 @@
                 <w:color w:val="38BDF8"/>
                 <w:sz w:val="19"/>
               </w:rPr>
-              <w:t>[Q4 — TIMER BOUNDARY EVENTS]</w:t>
+              <w:t>[Q4 — TIMER EVENT STRATEGIES]</w:t>
               <w:br/>
             </w:r>
             <w:r>
@@ -639,7 +669,7 @@
                 <w:color w:val="F8FAFC"/>
                 <w:sz w:val="22"/>
               </w:rPr>
-              <w:t>Why are timer events useful, and where did you employ interrupting vs. non-interrupting timer boundary events?</w:t>
+              <w:t>Compare the timer boundary event strategies between the academic system (Q1) and the banking system (Q2).</w:t>
             </w:r>
           </w:p>
         </w:tc>
@@ -683,13 +713,25 @@
                 <w:color w:val="1E293B"/>
                 <w:sz w:val="20"/>
               </w:rPr>
-              <w:t>Timer events prevent workflows from stalling indefinitely due to unresponsive human actors or external service latency. In our project, we intentionally implemented both types:</w:t>
+              <w:t>Timer boundary events prevent silent process stagnation. We used distinct temporal strategies suited to each domain:</w:t>
               <w:br/>
               <w:br/>
-              <w:t>• Interrupting Timer Boundary Event (7-Day Offer Expiry): Attached to 'Review Loan Offer'. If the applicant does not accept or respond within 7 days, the offer legally expires. The task is instantly aborted, preventing stale credit terms from being executed, and the process routes to 'EndEvent: Loan Offer Expired'.</w:t>
+              <w:t>• Question 1 (Academic Deadlines &amp; Escalations):</w:t>
+              <w:br/>
+              <w:t xml:space="preserve">  - 14-Day Interrupting Timer on proposal preparation: Hard departmental cut-off. If students fail to submit, the draft is cancelled, routing to 'EndEvent: Proposal Lapsed'.</w:t>
+              <w:br/>
+              <w:t xml:space="preserve">  - 10-Day Non-Interrupting Timer on committee evaluation: Academic SLA reminder. Does not abort faculty review; dispatches an escalation notification to the Head of Department (HoD).</w:t>
+              <w:br/>
+              <w:t xml:space="preserve">  - 3-Day Event Timer on guide response: Prompts reallocation if faculty remains silent.</w:t>
               <w:br/>
               <w:br/>
-              <w:t>• Non-Interrupting Timer Boundary Event (24-Hour Credit Bureau SLA &amp; 48-Hour E-Sign SLA): Attached to 'Request Credit Report' and 'E-Sign Loan Agreement'. If the credit bureau does not reply within 24 hours, a parallel retry is dispatched without cancelling the original request. If e-signing takes longer than 48 hours, a parallel administrative alert notifies operations to prepare physical wet-signature documents while keeping the digital portal active.</w:t>
+              <w:t>• Question 2 (Banking SLAs &amp; Offer Expirations):</w:t>
+              <w:br/>
+              <w:t xml:space="preserve">  - 24-Hour Non-Interrupting Timer on credit request: Triggers asynchronous API retries without invalidating the customer session.</w:t>
+              <w:br/>
+              <w:t xml:space="preserve">  - 48-Hour Non-Interrupting Timer on e-signature: Triggers operations wet-signature preparation while leaving the customer digital signing portal open.</w:t>
+              <w:br/>
+              <w:t xml:space="preserve">  - 7-Day Interrupting Timer on loan offer review: Enforces financial interest rate validity; cancels offer and routes to 'EndEvent: Loan Offer Expired'.</w:t>
             </w:r>
           </w:p>
         </w:tc>
@@ -729,7 +771,7 @@
                 <w:color w:val="38BDF8"/>
                 <w:sz w:val="19"/>
               </w:rPr>
-              <w:t>[Q5 — PROCESS FLOW DEFINITIONS]</w:t>
+              <w:t>[Q5 — HAPPY PATH VS CRITICAL PATH]</w:t>
               <w:br/>
             </w:r>
             <w:r>
@@ -783,12 +825,17 @@
                 <w:color w:val="1E293B"/>
                 <w:sz w:val="20"/>
               </w:rPr>
-              <w:t>The 'Happy Path' (or default success path) is the sequence of activities that executes when everything proceeds under ideal conditions with zero exceptions, data validation errors, or rejections (in our model: Submission → Completeness Check → Parallel KYC/Credit/DTI Checks → Income Verification → Auto-Approval → Offer Dispatch → Acceptance → E-Sign → NEFT Disbursement).</w:t>
+              <w:t>The 'Happy Path' describes the optimal, uninterrupted business trajectory where all forms are complete, all criteria pass, and value is delivered with zero rework:</w:t>
               <w:br/>
               <w:br/>
-              <w:t>Why it is NOT necessarily the 'Critical Path':</w:t>
+              <w:t>• Q1 Happy Path: Student Submits → Completeness Check Passes → Team Rules Pass → Coordinator Screens → Similarity Passes → Committee Approves → DMN Matches Guide → Auto-Allocate → Guide Accepts → Student Acknowledges → Guide Confirmed End.</w:t>
               <w:br/>
-              <w:t>In formal project management and operations research, the Critical Path Method (CPM) requires quantitative duration data (mean activity durations, variance, earliest/latest start and finish times). The Critical Path is the longest duration path with zero total float/slack. BPMN models describe behavioral control flow and choreography, not duration mathematics. Calling the happy path the 'critical path' without empiric timing data confuses business priority with mathematical CPM. In our defence, we clarify that the Happy Path represents the 'Business-Critical Flow'.</w:t>
+              <w:t>• Q2 Happy Path: Applicant Submits → Completeness Passes → Parallel KYC/Credit/DTI Pass → Income Verified → Auto-Approval → Offer Dispatched → Accepted → E-Signed → Core Banking Disburses → Loan Disbursed End.</w:t>
+              <w:br/>
+              <w:br/>
+              <w:t>Why it is NOT mathematically the 'Critical Path':</w:t>
+              <w:br/>
+              <w:t>In formal project scheduling (CPM/PERT), the Critical Path is the sequence of dependent tasks with zero total slack, determined strictly by quantitative duration data. BPMN models behavioral control-flow semantics. Calling the happy path the critical path without empiric duration log data is a methodology error. We define the happy path as the 'Business-Critical Flow'.</w:t>
             </w:r>
           </w:p>
         </w:tc>
@@ -828,7 +875,7 @@
                 <w:color w:val="38BDF8"/>
                 <w:sz w:val="19"/>
               </w:rPr>
-              <w:t>[Q6 — ALTERNATE PATHS &amp; RECOVERY]</w:t>
+              <w:t>[Q6 — ALTERNATE PATHS: QUESTION 1]</w:t>
               <w:br/>
             </w:r>
             <w:r>
@@ -838,7 +885,7 @@
                 <w:color w:val="F8FAFC"/>
                 <w:sz w:val="22"/>
               </w:rPr>
-              <w:t>How is an alternate path handled in your BPMN model? Give a concrete example.</w:t>
+              <w:t>How are alternate and exception paths handled in Question 1? Give concrete examples of revision and reallocation loops.</w:t>
             </w:r>
           </w:p>
         </w:tc>
@@ -882,12 +929,23 @@
                 <w:color w:val="1E293B"/>
                 <w:sz w:val="20"/>
               </w:rPr>
-              <w:t>An alternate path represents a legitimate business variation that diverges from the standard auto-approval route but does not represent a catastrophic failure.</w:t>
+              <w:t>In Question 1, alternate paths resolve academic weaknesses and resource constraints without premature student failure:</w:t>
               <w:br/>
               <w:br/>
-              <w:t>Concrete Example: Underwriter Manual Review &amp; Collateral Re-valuation (L7 &amp; L8):</w:t>
+              <w:t>1. Committee Revision Loop (F5):</w:t>
               <w:br/>
-              <w:t>When the scoring engine evaluates a borderline credit profile (score 600–749), an Exclusive Gateway branches away from the Happy Path to the Underwriter lane for manual review. The underwriter can require collateral. An appraiser inspects the asset. If the Loan-to-Value (LTV) ratio is insufficient, a 'Re-Underwrite' task loops back with adjusted loan amounts. Once satisfactory collateral is secured, the underwriter issues an approval, and the token seamlessly rejoins the Happy Path at 'Generate Loan Offer Letter'.</w:t>
+              <w:t xml:space="preserve">   - When the Review Committee evaluates a proposal as scientifically salvageable but requiring modification, an Exclusive Gateway routes to 'Send Revision Feedback'.</w:t>
+              <w:br/>
+              <w:t xml:space="preserve">   - The student team receives feedback via an Intermediate Message Catch Event, updates the abstract/scope, and resubmits.</w:t>
+              <w:br/>
+              <w:t xml:space="preserve">   - The proposal re-enters similarity checking. To avoid endless loops, the engine caps revision cycles at 2 iterations before forcing approval or rejection.</w:t>
+              <w:br/>
+              <w:br/>
+              <w:t>2. Guide Decline &amp; Reallocation Loop (F8 &amp; F9):</w:t>
+              <w:br/>
+              <w:t xml:space="preserve">   - If the automated DMN matching finds no available guide or the assigned faculty declines, an Exclusive Gateway diverts to 'Manual Guide Allocation' in the Coordinator lane.</w:t>
+              <w:br/>
+              <w:t xml:space="preserve">   - The coordinator can assign an alternate faculty member, appoint an external co-guide, or waitlist the team. If manual assignment succeeds, flow rejoins confirmation; if impossible, it ends at 'No Guide Available'.</w:t>
             </w:r>
           </w:p>
         </w:tc>
@@ -927,7 +985,7 @@
                 <w:color w:val="38BDF8"/>
                 <w:sz w:val="19"/>
               </w:rPr>
-              <w:t>[Q7 — FAILURE HANDLING &amp; DEADLOCKS]</w:t>
+              <w:t>[Q7 — ALTERNATE PATHS: QUESTION 2]</w:t>
               <w:br/>
             </w:r>
             <w:r>
@@ -937,7 +995,7 @@
                 <w:color w:val="F8FAFC"/>
                 <w:sz w:val="22"/>
               </w:rPr>
-              <w:t>What happens when retry limits are exhausted in your loop constructs?</w:t>
+              <w:t>How are alternate paths handled in Question 2? Explain the Underwriter Collateral Loop and Counter-Offer Negotiation.</w:t>
             </w:r>
           </w:p>
         </w:tc>
@@ -981,16 +1039,19 @@
                 <w:color w:val="1E293B"/>
                 <w:sz w:val="20"/>
               </w:rPr>
-              <w:t>Unbounded loops are a severe anti-pattern in BPMN because they risk infinite execution deadlocks and resource exhaustion. In our model:</w:t>
+              <w:t>In Question 2, alternate paths manage credit risk and commercial terms:</w:t>
               <w:br/>
               <w:br/>
-              <w:t>1. Document Correction Loop (L1): When incomplete documents are submitted, the applicant is given an opportunity to resubmit. This loop is bounded by a maximum retry limit and a lapse timer. If the applicant fails to provide correct documents within the limit, the loop terminates to 'EndEvent: Application Lapsed'.</w:t>
+              <w:t>1. Underwriting &amp; Collateral Re-valuation Loop (L7 &amp; L8):</w:t>
+              <w:br/>
+              <w:t xml:space="preserve">   - When scoring produces a borderline risk tier (score 600–749), the Exclusive Gateway bypasses auto-approval to 'Underwriter Full Manual Review'.</w:t>
+              <w:br/>
+              <w:t xml:space="preserve">   - The underwriter can mandate collateral backing. A valuation task inspects the asset. If the appraised Loan-to-Value (LTV) is insufficient, 'Re-Underwrite' loops back with reduced loan limits or requires additional security. Once satisfied, the underwriter approves and rejoins offer generation.</w:t>
               <w:br/>
               <w:br/>
-              <w:t>2. Credit Bureau Retry Loop (L4): The non-interrupting timer triggers automated retry requests. If retries hit the maximum threshold without an API response, the process escapes to a manual credit assessment fallback by the Loan Officer.</w:t>
+              <w:t>2. Counter-Offer Negotiation Loop (L10):</w:t>
               <w:br/>
-              <w:br/>
-              <w:t>Every loop in our model has an explicit escape condition leading to an auditable terminal end state.</w:t>
+              <w:t xml:space="preserve">   - Upon receiving the offer, the borrower can select 'Counter-Offer'. A Loan Officer evaluates requested interest rate/tenor adjustments. If accepted, modified terms are finalized; if rejected, the flow concludes as rejected or withdrawn.</w:t>
             </w:r>
           </w:p>
         </w:tc>
@@ -1030,7 +1091,7 @@
                 <w:color w:val="38BDF8"/>
                 <w:sz w:val="19"/>
               </w:rPr>
-              <w:t>[Q8 — ERROR HANDLING VS COMPENSATION]</w:t>
+              <w:t>[Q8 — LOOP CONTROL &amp; DEADLOCKS]</w:t>
               <w:br/>
             </w:r>
             <w:r>
@@ -1040,7 +1101,7 @@
                 <w:color w:val="F8FAFC"/>
                 <w:sz w:val="22"/>
               </w:rPr>
-              <w:t>Why is Transactional Compensation fundamentally different from ordinary Error Handling in BPMN 2.0?</w:t>
+              <w:t>What happens when retry limits are exhausted in your loop constructs across both projects?</w:t>
             </w:r>
           </w:p>
         </w:tc>
@@ -1084,16 +1145,24 @@
                 <w:color w:val="1E293B"/>
                 <w:sz w:val="20"/>
               </w:rPr>
-              <w:t>This is a common theoretical trap during viva examinations:</w:t>
+              <w:t>Unbounded loops are a severe anti-pattern in BPMN, causing infinite token circulation and resource exhaustion. Both our models enforce strict loop boundaries:</w:t>
               <w:br/>
               <w:br/>
-              <w:t>• Error Handling (Forward Recovery): Traps a fault during execution (e.g., our Interrupting Error Boundary Event on 'Disburse Loan Funds'). The active task failed, was interrupted, and the process routes forward to a retry or administrative resolution task. No previous completed tasks need their effects reversed.</w:t>
+              <w:t>• In Question 1:</w:t>
+              <w:br/>
+              <w:t xml:space="preserve">  - Proposal correction loop (F1) is capped at 2 attempts, after which the application is terminated.</w:t>
+              <w:br/>
+              <w:t xml:space="preserve">  - Committee revision loop (F5) is strictly capped at 2 cycles. On the third review, the committee must issue a final Approve or Reject decision.</w:t>
               <w:br/>
               <w:br/>
-              <w:t>• Compensation (Backward Rollback / Undo): Triggered by a Compensation Intermediate/End Event. It cancels or undoes the business effects of already-completed, committed tasks. For example, if funds had already been debited from a reserve pool and the loan was subsequently aborted, a compensation handler would credit the reserve pool back.</w:t>
+              <w:t>• In Question 2:</w:t>
+              <w:br/>
+              <w:t xml:space="preserve">  - Document correction (L1) has a 14-day lapse timer.</w:t>
+              <w:br/>
+              <w:t xml:space="preserve">  - Credit Bureau retry requests (L4) are capped at 3 attempts; if unfulfilled, the process falls back to manual credit assessment.</w:t>
               <w:br/>
               <w:br/>
-              <w:t>Our disbursement failure uses Error Handling because the transfer API failed before commitment, requiring forward retry rather than retrospective rollback.</w:t>
+              <w:t>Every loop in our models possesses a deterministic escape condition leading to an auditable terminal end event.</w:t>
             </w:r>
           </w:p>
         </w:tc>
@@ -1133,7 +1202,7 @@
                 <w:color w:val="38BDF8"/>
                 <w:sz w:val="19"/>
               </w:rPr>
-              <w:t>[Q9 — PROJECT-SPECIFIC ARCHITECTURE]</w:t>
+              <w:t>[Q9 — ERROR RECOVERY VS COMPENSATION]</w:t>
               <w:br/>
             </w:r>
             <w:r>
@@ -1143,7 +1212,7 @@
                 <w:color w:val="F8FAFC"/>
                 <w:sz w:val="22"/>
               </w:rPr>
-              <w:t>Why is the Credit Bureau modelled as an external Pool rather than another Lane inside the Bank Pool?</w:t>
+              <w:t>Why is Transactional Compensation fundamentally different from Error Handling, and where is each used in your projects?</w:t>
             </w:r>
           </w:p>
         </w:tc>
@@ -1187,10 +1256,17 @@
                 <w:color w:val="1E293B"/>
                 <w:sz w:val="20"/>
               </w:rPr>
-              <w:t>In BPMN 2.0 specification standards, Pools represent independent participants or separate legal entities/organizations with distinct governance boundaries. Lanes, conversely, represent sub-partitions within a single organization (such as departments or software systems).</w:t>
+              <w:t>This is a common theoretical viva question:</w:t>
               <w:br/>
               <w:br/>
-              <w:t>The Credit Bureau (e.g., CIBIL, Experian) is an autonomous external entity with its own internal processes and databases. According to BPMN 2.0 rules, Sequence Flows CANNOT cross Pool boundaries. Only Message Flows (dashed arrows with open circles) are permitted between pools. Modelling the Credit Bureau as an external Pool accurately captures cross-organizational, asynchronous message choreography.</w:t>
+              <w:t>• Error Handling (Forward Recovery): Catches a fault during active execution and takes an alternate forward route to resolve or terminate the error.</w:t>
+              <w:br/>
+              <w:t xml:space="preserve">  - Q2 Example: Interrupting Error Boundary Event on 'Disburse Loan Funds'. The NEFT/RTGS API failed before transaction completion, so the token diverts to an Operations User Task for retry. No previous completed milestones need reversal.</w:t>
+              <w:br/>
+              <w:br/>
+              <w:t>• Compensation (Backward Rollback / Undo): Triggered by a Compensation Event. It retroactively cancels the business effect of ALREADY COMPLETED and committed activities.</w:t>
+              <w:br/>
+              <w:t xml:space="preserve">  - Q1 Example: When a student withdraws after committee approval (F11), a Script Task triggers compensation logic that releases the pre-assigned faculty guide reservation and decrements their workload counter in the database.</w:t>
             </w:r>
           </w:p>
         </w:tc>
@@ -1230,7 +1306,7 @@
                 <w:color w:val="38BDF8"/>
                 <w:sz w:val="19"/>
               </w:rPr>
-              <w:t>[Q10 — COMPLIANCE &amp; FRAUD ARCHITECTURE]</w:t>
+              <w:t>[Q10 — POOLS VS LANES DISCIPLINE]</w:t>
               <w:br/>
             </w:r>
             <w:r>
@@ -1240,7 +1316,7 @@
                 <w:color w:val="F8FAFC"/>
                 <w:sz w:val="22"/>
               </w:rPr>
-              <w:t>How does your model ensure zero-tolerance compliance for KYC and AML violations?</w:t>
+              <w:t>Why is the Credit Bureau modelled as an external Pool in Question 2, whereas Question 1 is modelled entirely within a single Pool with 5 Lanes?</w:t>
             </w:r>
           </w:p>
         </w:tc>
@@ -1284,16 +1360,18 @@
                 <w:color w:val="1E293B"/>
                 <w:sz w:val="20"/>
               </w:rPr>
-              <w:t>Regulatory banking frameworks (such as RBI and FATF guidelines) mandate strict compliance isolation:</w:t>
+              <w:t>Under OMG BPMN 2.0 specification standards:</w:t>
               <w:br/>
               <w:br/>
-              <w:t>• In our model, KYC Identity Verification (L2) and AML Screening (L3) execute immediately after document completeness.</w:t>
+              <w:t>• Pools represent independent participants or distinct legal/organizational entities.</w:t>
               <w:br/>
-              <w:t>• If automated KYC fails, it routes to a Compliance Officer User Task. If identity cannot be proven, the application routes to 'EndEvent: Fraud Terminated'.</w:t>
+              <w:t>• Lanes represent sub-partitions within a single organization (departments, user roles, internal software components).</w:t>
               <w:br/>
-              <w:t>• For AML screening, if an applicant matches a sanctioned entity or fraud registry, the application is instantly halted, investigated, and diverted to 'EndEvent: Application Terminated – Fraud/AML Violation'.</w:t>
               <w:br/>
-              <w:t>• Because these checks are joined via the Parallel Gateway, an application with an unresolvable AML flag CAN NEVER bypass compliance or reach underwriting.</w:t>
+              <w:t>In Question 1, the Student, Coordinator, Committee, Guide, and System all belong to the SAME university department. Sequence flows can freely pass tokens across lanes within the same pool.</w:t>
+              <w:br/>
+              <w:br/>
+              <w:t>In Question 2, the Credit Bureau (e.g., CIBIL, Experian) is an autonomous commercial enterprise outside the bank's boundary. BPMN 2.0 strictly FORBIDS Sequence Flows from crossing Pool boundaries. Communication must occur exclusively via Message Flows (dashed arrows). Modelling the Credit Bureau as an external Pool correctly enforces B2B asynchronous message exchange.</w:t>
             </w:r>
           </w:p>
         </w:tc>
@@ -1333,7 +1411,7 @@
                 <w:color w:val="38BDF8"/>
                 <w:sz w:val="19"/>
               </w:rPr>
-              <w:t>[Q11 — TECHNICAL FAULT ISOLATION]</w:t>
+              <w:t>[Q11 — TECHNICAL FAULT CONTAINMENT]</w:t>
               <w:br/>
             </w:r>
             <w:r>
@@ -1343,7 +1421,7 @@
                 <w:color w:val="F8FAFC"/>
                 <w:sz w:val="22"/>
               </w:rPr>
-              <w:t>How does the model prevent double-disbursement or untracked financial transactions when Core Banking fails?</w:t>
+              <w:t>How do your models contain technical infrastructure failures (notification delivery in Q1 and disbursement in Q2)?</w:t>
             </w:r>
           </w:p>
         </w:tc>
@@ -1387,10 +1465,17 @@
                 <w:color w:val="1E293B"/>
                 <w:sz w:val="20"/>
               </w:rPr>
-              <w:t>Automated disbursement is executed by a Service Task ('Disburse Loan Funds') in the Core Banking lane. In financial systems, technical faults (network timeouts during NEFT/RTGS handshakes, database locks, or frozen beneficiary accounts) can cause catastrophic reconciliation errors if not trapped.</w:t>
+              <w:t>Both models contain technical failures using Interrupting and Non-Interrupting Error Boundary Events:</w:t>
               <w:br/>
               <w:br/>
-              <w:t>We attached an Interrupting Error Boundary Event to this Service Task. If the core banking integration throws an exception, the boundary event catches it, cancels automated execution to prevent duplicate transactions, and diverts the token to Operations for manual reconciliation and retry ('Retry Disbursement'). If the retry succeeds, the loan account is created; if permanent failure occurs, the process terminates to 'EndEvent: Disbursement Failed – Manual Intervention Required'.</w:t>
+              <w:t>• In Question 1 (F10 - Notification Delivery Failure):</w:t>
+              <w:br/>
+              <w:t xml:space="preserve">  - An Error Boundary Event on 'Send Allocation Notification' catches email/portal server outages. It isolates the error, preventing the guide allocation from being corrupted, and routes to 'EndEvent: System Failure – Manual IT Recovery Required'.</w:t>
+              <w:br/>
+              <w:br/>
+              <w:t>• In Question 2 (L12 - Core Banking Disbursement Failure):</w:t>
+              <w:br/>
+              <w:t xml:space="preserve">  - An Interrupting Error Boundary Event on 'Disburse Loan Funds' catches payment gateway timeouts, invalid account formats, or frozen accounts during NEFT/RTGS handshakes. Execution is immediately halted to prevent double transfers, and the token routes to Operations for manual investigation and fallback retry.</w:t>
             </w:r>
           </w:p>
         </w:tc>
@@ -1440,7 +1525,7 @@
                 <w:color w:val="F8FAFC"/>
                 <w:sz w:val="22"/>
               </w:rPr>
-              <w:t>What tools did you use to validate your BPMN 2.0 XML diagram, and how do you prove its syntactic correctness?</w:t>
+              <w:t>What tools did you use to validate your BPMN 2.0 XML diagrams, and how do you prove syntactic and semantic compliance?</w:t>
             </w:r>
           </w:p>
         </w:tc>
@@ -1484,14 +1569,14 @@
                 <w:color w:val="1E293B"/>
                 <w:sz w:val="20"/>
               </w:rPr>
-              <w:t>Our diagram was developed and validated using industry-standard BPMN tooling:</w:t>
+              <w:t>Both BPMN 2.0 diagrams were verified using industry-standard tooling:</w:t>
               <w:br/>
               <w:br/>
-              <w:t>1. Camunda Modeler (v5.49.0): Opened the generated XML to confirm that all flow node elements, BPMNDI visual coordinate bounds, lane containment sets, and boundary event attachments render cleanly without parse warnings.</w:t>
+              <w:t>1. Camunda Modeler (v5.49.0): Opened both `.bpmn` files to confirm that all flow node elements, BPMNDI visual coordinate bounds, lane containment sets, and boundary event attachments render cleanly without parse warnings or broken connections.</w:t>
               <w:br/>
-              <w:t>2. bpmn-js / bpmn-to-image Engine: Headless browser rendering validated complete DOM parsing and generated high-resolution PNG exports without any unparsable tag errors.</w:t>
+              <w:t>2. bpmn-js / bpmn-to-image Engine: Headless browser rendering validated DOM parsing and generated high-resolution PNG exports without XML tag errors.</w:t>
               <w:br/>
-              <w:t>3. OMG BPMN 2.0 Schema Conformance: Ensured strict namespace declarations (`http://www.omg.org/spec/BPMN/20100524/MODEL` and `http://www.omg.org/spec/BPMN/20100524/DI`), valid IDs for all flow elements, and correct directional sequence and message flow references.</w:t>
+              <w:t>3. OMG BPMN 2.0 Schema Conformance: Verified namespace declarations (`http://www.omg.org/spec/BPMN/20100524/MODEL` and `http://www.omg.org/spec/BPMN/20100524/DI`), unique XML IDs, valid sequence and message flow references, and correct pool boundary encapsulation.</w:t>
             </w:r>
           </w:p>
         </w:tc>

</xml_diff>